<commit_message>
fix: restrict forgot-password OTP to email only
Remove phone/SMS option from the reset flow so OTP channel matches email delivery.

Co-authored-by: Cursor <cursoragent@cursor.com>
</commit_message>
<xml_diff>
--- a/docs/GYMFINDER_dacta.docx
+++ b/docs/GYMFINDER_dacta.docx
@@ -1,6 +1,6 @@
 
 <file path=word/document.xml><?xml version="1.0" encoding="utf-8"?>
-<w:document xmlns:wpc="http://schemas.microsoft.com/office/word/2010/wordprocessingCanvas" xmlns:cx="http://schemas.microsoft.com/office/drawing/2014/chartex" xmlns:cx1="http://schemas.microsoft.com/office/drawing/2015/9/8/chartex" xmlns:cx2="http://schemas.microsoft.com/office/drawing/2015/10/21/chartex" xmlns:cx3="http://schemas.microsoft.com/office/drawing/2016/5/9/chartex" xmlns:cx4="http://schemas.microsoft.com/office/drawing/2016/5/10/chartex" xmlns:cx5="http://schemas.microsoft.com/office/drawing/2016/5/11/chartex" xmlns:cx6="http://schemas.microsoft.com/office/drawing/2016/5/12/chartex" xmlns:cx7="http://schemas.microsoft.com/office/drawing/2016/5/13/chartex" xmlns:cx8="http://schemas.microsoft.com/office/drawing/2016/5/14/chartex" xmlns:mc="http://schemas.openxmlformats.org/markup-compatibility/2006" xmlns:aink="http://schemas.microsoft.com/office/drawing/2016/ink" xmlns:am3d="http://schemas.microsoft.com/office/drawing/2017/model3d" xmlns:o="urn:schemas-microsoft-com:office:office" xmlns:oel="http://schemas.microsoft.com/office/2019/extlst" xmlns:r="http://schemas.openxmlformats.org/officeDocument/2006/relationships" xmlns:m="http://schemas.openxmlformats.org/officeDocument/2006/math" xmlns:v="urn:schemas-microsoft-com:vml" xmlns:wp14="http://schemas.microsoft.com/office/word/2010/wordprocessingDrawing" xmlns:wp="http://schemas.openxmlformats.org/drawingml/2006/wordprocessingDrawing" xmlns:w10="urn:schemas-microsoft-com:office:word" xmlns:w="http://schemas.openxmlformats.org/wordprocessingml/2006/main" xmlns:w14="http://schemas.microsoft.com/office/word/2010/wordml" xmlns:w15="http://schemas.microsoft.com/office/word/2012/wordml" xmlns:w16cex="http://schemas.microsoft.com/office/word/2018/wordml/cex" xmlns:w16cid="http://schemas.microsoft.com/office/word/2016/wordml/cid" xmlns:w16="http://schemas.microsoft.com/office/word/2018/wordml" xmlns:w16sdtdh="http://schemas.microsoft.com/office/word/2020/wordml/sdtdatahash" xmlns:w16se="http://schemas.microsoft.com/office/word/2015/wordml/symex" xmlns:wpg="http://schemas.microsoft.com/office/word/2010/wordprocessingGroup" xmlns:wpi="http://schemas.microsoft.com/office/word/2010/wordprocessingInk" xmlns:wne="http://schemas.microsoft.com/office/word/2006/wordml" xmlns:wps="http://schemas.microsoft.com/office/word/2010/wordprocessingShape" mc:Ignorable="w14 w15 w16se w16cid w16 w16cex w16sdtdh wp14">
+<w:document xmlns:ns1="http://schemas.openxmlformats.org/markup-compatibility/2006" xmlns:ns2="http://schemas.openxmlformats.org/officeDocument/2006/relationships" xmlns:w="http://schemas.openxmlformats.org/wordprocessingml/2006/main" ns1:Ignorable="w14 w15 w16se w16cid w16 w16cex w16sdtdh wp14">
   <w:body>
     <w:p>
       <w:pPr>
@@ -1268,7 +1268,7 @@
           <w:rFonts w:ascii="Times New Roman" w:eastAsia="Times New Roman" w:hAnsi="Times New Roman" w:cs="Times New Roman"/>
         </w:rPr>
         <w:lastRenderedPageBreak/>
-        <w:t>AUTH-06 — Quên mật khẩu bằng OTP email: (1) nhập email/SĐT; (2) nhập mã OTP 6 số (hiệu lực 10 phút, tối đa 5 lần thử sai); (3) đặt mật khẩu mới. OTP được lưu trong bảng password_reset_otps (hash, hết hạn, số lần thử, verified_at/consumed_at). Gửi email SMTP có thể bổ sung; khi chưa cấu hình SMTP, UI được phép hiển thị mã demo tạm để kiểm thử. Không dùng SMS OTP trong phạm vi mặc định.</w:t>
+        <w:t>AUTH-06 — Quên mật khẩu bằng OTP email: (1) nhập email đăng ký; (2) nhập mã OTP 6 số (hiệu lực 10 phút, tối đa 5 lần thử sai); (3) đặt mật khẩu mới. OTP được lưu trong bảng password_reset_otps (hash, hết hạn, số lần thử, verified_at/consumed_at). Gửi email SMTP có thể bổ sung; khi chưa cấu hình SMTP, UI được phép hiển thị mã demo tạm để kiểm thử. Không dùng SMS OTP trong phạm vi mặc định.</w:t>
       </w:r>
     </w:p>
     <w:p>
@@ -5707,7 +5707,7 @@
               <w:spacing w:after="20"/>
             </w:pPr>
             <w:r>
-              <w:t>Quên mật khẩu OTP email (UI 3 bước + bảng password_reset_otps; gửi SMTP khi đủ hạ tầng); trang Điều khoản dịch vụ và Chính sách bảo mật; cải tiến UX nhỏ hoặc báo cáo quản trị bổ sung nếu đủ thời gian và không ảnh hưởng P0.</w:t>
+              <w:t>Quên mật khẩu OTP qua email — không SMS/SĐT (UI 3 bước + bảng password_reset_otps; gửi SMTP khi đủ hạ tầng); trang Điều khoản dịch vụ và Chính sách bảo mật; cải tiến UX nhỏ hoặc báo cáo quản trị bổ sung nếu đủ thời gian và không ảnh hưởng P0.</w:t>
             </w:r>
           </w:p>
         </w:tc>
@@ -6079,8 +6079,8 @@
     <w:p/>
     <w:p/>
     <w:sectPr>
-      <w:headerReference w:type="default" r:id="rId8"/>
-      <w:footerReference w:type="default" r:id="rId9"/>
+      <w:headerReference w:type="default" ns2:id="rId8"/>
+      <w:footerReference w:type="default" ns2:id="rId9"/>
       <w:pgSz w:w="12240" w:h="15840"/>
       <w:pgMar w:top="1008" w:right="1152" w:bottom="1008" w:left="1152" w:header="720" w:footer="720" w:gutter="0"/>
       <w:cols w:space="720"/>

</xml_diff>